<commit_message>
docs(specs): apb offset is 14 bits in five MAS
Follows the contract change of #77 (meta.apb_paddr_width 12 -> 14).

- TIMER V2.6, I2C V3.1, UART V3.1, WDT V1.1, SCRC V3.3: the
  i_bus_apb_paddr row says 14. No change in behaviour: each IP decodes
  the same low bits as before. TIMER also drops "P_BUS subtracts the
  base"; nothing does, the window is aligned to its size.
- The decision records keep their original row and gain a note:
  TIMER, UART, I2C, DMA.
- docx rebuilt for the five specifications that changed.

Not touched: PWM (open pull requests), SYSCSR (SharePoint V3.2 is
newer), DMA MAS (being rewritten for dma_axi32), and the frozen V2.3
text inside SCRC_DECISIONS.
</commit_message>
<xml_diff>
--- a/doc/specs/docx/QNSC_I2C_MAS.docx
+++ b/doc/specs/docx/QNSC_I2C_MAS.docx
@@ -15,7 +15,7 @@
         <w:pStyle w:val="Subtitle"/>
       </w:pPr>
       <w:r>
-        <w:t xml:space="preserve">MICRO-ARCHITECTURE SPECIFICATION – V3.0</w:t>
+        <w:t xml:space="preserve">MICRO-ARCHITECTURE SPECIFICATION – V3.1</w:t>
       </w:r>
     </w:p>
     <w:p>
@@ -457,6 +457,92 @@
           </w:p>
         </w:tc>
       </w:tr>
+      <w:tr>
+        <w:tc>
+          <w:tcPr/>
+          <w:p>
+            <w:pPr>
+              <w:pStyle w:val="Compact"/>
+              <w:jc w:val="left"/>
+            </w:pPr>
+            <w:r>
+              <w:t xml:space="preserve">V3.1</w:t>
+            </w:r>
+          </w:p>
+        </w:tc>
+        <w:tc>
+          <w:tcPr/>
+          <w:p>
+            <w:pPr>
+              <w:pStyle w:val="Compact"/>
+              <w:jc w:val="left"/>
+            </w:pPr>
+            <w:r>
+              <w:t xml:space="preserve">2026-10-15</w:t>
+            </w:r>
+          </w:p>
+        </w:tc>
+        <w:tc>
+          <w:tcPr/>
+          <w:p>
+            <w:pPr>
+              <w:pStyle w:val="Compact"/>
+              <w:jc w:val="left"/>
+            </w:pPr>
+            <w:r>
+              <w:t xml:space="preserve">Nghia VT (lead), for Ong Bao Vinh</w:t>
+            </w:r>
+          </w:p>
+        </w:tc>
+        <w:tc>
+          <w:tcPr/>
+          <w:p>
+            <w:pPr>
+              <w:pStyle w:val="Compact"/>
+              <w:jc w:val="left"/>
+            </w:pPr>
+            <w:r>
+              <w:t xml:space="preserve">–</w:t>
+            </w:r>
+          </w:p>
+        </w:tc>
+        <w:tc>
+          <w:tcPr/>
+          <w:p>
+            <w:pPr>
+              <w:pStyle w:val="Compact"/>
+              <w:jc w:val="left"/>
+            </w:pPr>
+            <w:r>
+              <w:rPr>
+                <w:rStyle w:val="VerbatimChar"/>
+              </w:rPr>
+              <w:t xml:space="preserve">i_bus_apb_paddr</w:t>
+            </w:r>
+            <w:r>
+              <w:t xml:space="preserve"> </w:t>
+            </w:r>
+            <w:r>
+              <w:t xml:space="preserve">is 14 bits, was 12: the contract</w:t>
+            </w:r>
+            <w:r>
+              <w:t xml:space="preserve"> </w:t>
+            </w:r>
+            <w:r>
+              <w:rPr>
+                <w:rStyle w:val="VerbatimChar"/>
+              </w:rPr>
+              <w:t xml:space="preserve">meta.apb_paddr_width</w:t>
+            </w:r>
+            <w:r>
+              <w:t xml:space="preserve"> </w:t>
+            </w:r>
+            <w:r>
+              <w:t xml:space="preserve">changed in #77 because the windows are 16 KiB. No change in behaviour</w:t>
+            </w:r>
+          </w:p>
+        </w:tc>
+      </w:tr>
     </w:tbl>
     <w:bookmarkEnd w:id="26"/>
     <w:bookmarkStart w:id="27" w:name="overview"/>
@@ -1963,7 +2049,7 @@
               <w:jc w:val="right"/>
             </w:pPr>
             <w:r>
-              <w:t xml:space="preserve">12</w:t>
+              <w:t xml:space="preserve">14</w:t>
             </w:r>
           </w:p>
         </w:tc>
@@ -6778,7 +6864,7 @@
       <w:rPr>
         <w:szCs w:val="26"/>
       </w:rPr>
-      <w:t>V3.0</w:t>
+      <w:t>V3.1</w:t>
     </w:r>
     <w:r>
       <w:rPr>

</xml_diff>

<commit_message>
docs(specs): apb offset is 14 bits in five MAS (#78)
Follows the contract change of #77 (meta.apb_paddr_width 12 -> 14).

- TIMER V2.6, I2C V3.1, UART V3.1, WDT V1.1, SCRC V3.3: the
  i_bus_apb_paddr row says 14. No change in behaviour: each IP decodes
  the same low bits as before. TIMER also drops "P_BUS subtracts the
  base"; nothing does, the window is aligned to its size.
- The decision records keep their original row and gain a note:
  TIMER, UART, I2C, DMA.
- docx rebuilt for the five specifications that changed.

Not touched: PWM (open pull requests), SYSCSR (SharePoint V3.2 is
newer), DMA MAS (being rewritten for dma_axi32), and the frozen V2.3
text inside SCRC_DECISIONS.
</commit_message>
<xml_diff>
--- a/doc/specs/docx/QNSC_I2C_MAS.docx
+++ b/doc/specs/docx/QNSC_I2C_MAS.docx
@@ -15,7 +15,7 @@
         <w:pStyle w:val="Subtitle"/>
       </w:pPr>
       <w:r>
-        <w:t xml:space="preserve">MICRO-ARCHITECTURE SPECIFICATION – V3.0</w:t>
+        <w:t xml:space="preserve">MICRO-ARCHITECTURE SPECIFICATION – V3.1</w:t>
       </w:r>
     </w:p>
     <w:p>
@@ -457,6 +457,92 @@
           </w:p>
         </w:tc>
       </w:tr>
+      <w:tr>
+        <w:tc>
+          <w:tcPr/>
+          <w:p>
+            <w:pPr>
+              <w:pStyle w:val="Compact"/>
+              <w:jc w:val="left"/>
+            </w:pPr>
+            <w:r>
+              <w:t xml:space="preserve">V3.1</w:t>
+            </w:r>
+          </w:p>
+        </w:tc>
+        <w:tc>
+          <w:tcPr/>
+          <w:p>
+            <w:pPr>
+              <w:pStyle w:val="Compact"/>
+              <w:jc w:val="left"/>
+            </w:pPr>
+            <w:r>
+              <w:t xml:space="preserve">2026-10-15</w:t>
+            </w:r>
+          </w:p>
+        </w:tc>
+        <w:tc>
+          <w:tcPr/>
+          <w:p>
+            <w:pPr>
+              <w:pStyle w:val="Compact"/>
+              <w:jc w:val="left"/>
+            </w:pPr>
+            <w:r>
+              <w:t xml:space="preserve">Nghia VT (lead), for Ong Bao Vinh</w:t>
+            </w:r>
+          </w:p>
+        </w:tc>
+        <w:tc>
+          <w:tcPr/>
+          <w:p>
+            <w:pPr>
+              <w:pStyle w:val="Compact"/>
+              <w:jc w:val="left"/>
+            </w:pPr>
+            <w:r>
+              <w:t xml:space="preserve">–</w:t>
+            </w:r>
+          </w:p>
+        </w:tc>
+        <w:tc>
+          <w:tcPr/>
+          <w:p>
+            <w:pPr>
+              <w:pStyle w:val="Compact"/>
+              <w:jc w:val="left"/>
+            </w:pPr>
+            <w:r>
+              <w:rPr>
+                <w:rStyle w:val="VerbatimChar"/>
+              </w:rPr>
+              <w:t xml:space="preserve">i_bus_apb_paddr</w:t>
+            </w:r>
+            <w:r>
+              <w:t xml:space="preserve"> </w:t>
+            </w:r>
+            <w:r>
+              <w:t xml:space="preserve">is 14 bits, was 12: the contract</w:t>
+            </w:r>
+            <w:r>
+              <w:t xml:space="preserve"> </w:t>
+            </w:r>
+            <w:r>
+              <w:rPr>
+                <w:rStyle w:val="VerbatimChar"/>
+              </w:rPr>
+              <w:t xml:space="preserve">meta.apb_paddr_width</w:t>
+            </w:r>
+            <w:r>
+              <w:t xml:space="preserve"> </w:t>
+            </w:r>
+            <w:r>
+              <w:t xml:space="preserve">changed in #77 because the windows are 16 KiB. No change in behaviour</w:t>
+            </w:r>
+          </w:p>
+        </w:tc>
+      </w:tr>
     </w:tbl>
     <w:bookmarkEnd w:id="26"/>
     <w:bookmarkStart w:id="27" w:name="overview"/>
@@ -1963,7 +2049,7 @@
               <w:jc w:val="right"/>
             </w:pPr>
             <w:r>
-              <w:t xml:space="preserve">12</w:t>
+              <w:t xml:space="preserve">14</w:t>
             </w:r>
           </w:p>
         </w:tc>
@@ -6778,7 +6864,7 @@
       <w:rPr>
         <w:szCs w:val="26"/>
       </w:rPr>
-      <w:t>V3.0</w:t>
+      <w:t>V3.1</w:t>
     </w:r>
     <w:r>
       <w:rPr>

</xml_diff>